<commit_message>
Added main interface function and modify it as well change its place to the main py file 2- add new account function have been modified 3 added check of input float function
</commit_message>
<xml_diff>
--- a/FC723 Portfolio Assessment 2 – Documentation/FC723 Portfolio Assessment 2 – P461989/psudocodes_and_notes.docx
+++ b/FC723 Portfolio Assessment 2 – Documentation/FC723 Portfolio Assessment 2 – P461989/psudocodes_and_notes.docx
@@ -257,15 +257,7 @@
         <w:t>-The app must store balance in 2’s compliments and display it to user in decimal.</w:t>
       </w:r>
       <w:r>
-        <w:t xml:space="preserve">  </w:t>
-      </w:r>
-      <w:proofErr w:type="gramStart"/>
-      <w:r>
-        <w:t>So</w:t>
-      </w:r>
-      <w:proofErr w:type="gramEnd"/>
-      <w:r>
-        <w:t xml:space="preserve"> I have to make 2 functions to convert from decimal to binary and the opposite.</w:t>
+        <w:t xml:space="preserve">  So I have to make 2 functions to convert from decimal to binary and the opposite.</w:t>
       </w:r>
     </w:p>
     <w:p>
@@ -279,21 +271,7 @@
         <w:rPr>
           <w:color w:val="FF0000"/>
         </w:rPr>
-        <w:t xml:space="preserve">Check Valid password </w:t>
-      </w:r>
-      <w:proofErr w:type="spellStart"/>
-      <w:r>
-        <w:rPr>
-          <w:color w:val="FF0000"/>
-        </w:rPr>
-        <w:t>psudocode</w:t>
-      </w:r>
-      <w:proofErr w:type="spellEnd"/>
-      <w:r>
-        <w:rPr>
-          <w:color w:val="FF0000"/>
-        </w:rPr>
-        <w:t>:</w:t>
+        <w:t>Check Valid password psudocode:</w:t>
       </w:r>
     </w:p>
     <w:p>
@@ -366,11 +344,76 @@
     </w:p>
     <w:p>
       <w:pPr>
+        <w:pBdr>
+          <w:bottom w:val="double" w:sz="6" w:space="1" w:color="auto"/>
+        </w:pBdr>
         <w:ind w:left="720"/>
       </w:pPr>
       <w:r>
         <w:lastRenderedPageBreak/>
         <w:t>If not return True</w:t>
+      </w:r>
+    </w:p>
+    <w:p>
+      <w:pPr>
+        <w:ind w:left="720"/>
+        <w:rPr>
+          <w:color w:val="FF0000"/>
+        </w:rPr>
+      </w:pPr>
+      <w:r>
+        <w:rPr>
+          <w:color w:val="FF0000"/>
+        </w:rPr>
+        <w:t>Deposit psudocode:</w:t>
+      </w:r>
+    </w:p>
+    <w:p>
+      <w:pPr>
+        <w:pStyle w:val="ListParagraph"/>
+        <w:numPr>
+          <w:ilvl w:val="0"/>
+          <w:numId w:val="5"/>
+        </w:numPr>
+      </w:pPr>
+      <w:r>
+        <w:t>Take the input as float</w:t>
+      </w:r>
+    </w:p>
+    <w:p>
+      <w:pPr>
+        <w:pStyle w:val="ListParagraph"/>
+        <w:numPr>
+          <w:ilvl w:val="0"/>
+          <w:numId w:val="5"/>
+        </w:numPr>
+      </w:pPr>
+      <w:r>
+        <w:t>Take the intger number out of the float</w:t>
+      </w:r>
+    </w:p>
+    <w:p>
+      <w:pPr>
+        <w:pStyle w:val="ListParagraph"/>
+        <w:numPr>
+          <w:ilvl w:val="0"/>
+          <w:numId w:val="5"/>
+        </w:numPr>
+      </w:pPr>
+      <w:r>
+        <w:t>Store the intger amount  in balance after converting it to 2’compleement</w:t>
+      </w:r>
+    </w:p>
+    <w:p>
+      <w:pPr>
+        <w:pStyle w:val="ListParagraph"/>
+        <w:numPr>
+          <w:ilvl w:val="0"/>
+          <w:numId w:val="5"/>
+        </w:numPr>
+      </w:pPr>
+      <w:r>
+        <w:t xml:space="preserve">Store the float amount in the floats_amount in the account </w:t>
       </w:r>
     </w:p>
     <w:p>
@@ -524,6 +567,95 @@
     </w:lvl>
   </w:abstractNum>
   <w:abstractNum w:abstractNumId="1" w15:restartNumberingAfterBreak="0">
+    <w:nsid w:val="3286739D"/>
+    <w:multiLevelType w:val="hybridMultilevel"/>
+    <w:tmpl w:val="71AC71EA"/>
+    <w:lvl w:ilvl="0" w:tplc="982074CE">
+      <w:start w:val="1"/>
+      <w:numFmt w:val="decimal"/>
+      <w:lvlText w:val="%1-"/>
+      <w:lvlJc w:val="left"/>
+      <w:pPr>
+        <w:ind w:left="1080" w:hanging="360"/>
+      </w:pPr>
+      <w:rPr>
+        <w:rFonts w:hint="default"/>
+      </w:rPr>
+    </w:lvl>
+    <w:lvl w:ilvl="1" w:tplc="08090019" w:tentative="1">
+      <w:start w:val="1"/>
+      <w:numFmt w:val="lowerLetter"/>
+      <w:lvlText w:val="%2."/>
+      <w:lvlJc w:val="left"/>
+      <w:pPr>
+        <w:ind w:left="1800" w:hanging="360"/>
+      </w:pPr>
+    </w:lvl>
+    <w:lvl w:ilvl="2" w:tplc="0809001B" w:tentative="1">
+      <w:start w:val="1"/>
+      <w:numFmt w:val="lowerRoman"/>
+      <w:lvlText w:val="%3."/>
+      <w:lvlJc w:val="right"/>
+      <w:pPr>
+        <w:ind w:left="2520" w:hanging="180"/>
+      </w:pPr>
+    </w:lvl>
+    <w:lvl w:ilvl="3" w:tplc="0809000F" w:tentative="1">
+      <w:start w:val="1"/>
+      <w:numFmt w:val="decimal"/>
+      <w:lvlText w:val="%4."/>
+      <w:lvlJc w:val="left"/>
+      <w:pPr>
+        <w:ind w:left="3240" w:hanging="360"/>
+      </w:pPr>
+    </w:lvl>
+    <w:lvl w:ilvl="4" w:tplc="08090019" w:tentative="1">
+      <w:start w:val="1"/>
+      <w:numFmt w:val="lowerLetter"/>
+      <w:lvlText w:val="%5."/>
+      <w:lvlJc w:val="left"/>
+      <w:pPr>
+        <w:ind w:left="3960" w:hanging="360"/>
+      </w:pPr>
+    </w:lvl>
+    <w:lvl w:ilvl="5" w:tplc="0809001B" w:tentative="1">
+      <w:start w:val="1"/>
+      <w:numFmt w:val="lowerRoman"/>
+      <w:lvlText w:val="%6."/>
+      <w:lvlJc w:val="right"/>
+      <w:pPr>
+        <w:ind w:left="4680" w:hanging="180"/>
+      </w:pPr>
+    </w:lvl>
+    <w:lvl w:ilvl="6" w:tplc="0809000F" w:tentative="1">
+      <w:start w:val="1"/>
+      <w:numFmt w:val="decimal"/>
+      <w:lvlText w:val="%7."/>
+      <w:lvlJc w:val="left"/>
+      <w:pPr>
+        <w:ind w:left="5400" w:hanging="360"/>
+      </w:pPr>
+    </w:lvl>
+    <w:lvl w:ilvl="7" w:tplc="08090019" w:tentative="1">
+      <w:start w:val="1"/>
+      <w:numFmt w:val="lowerLetter"/>
+      <w:lvlText w:val="%8."/>
+      <w:lvlJc w:val="left"/>
+      <w:pPr>
+        <w:ind w:left="6120" w:hanging="360"/>
+      </w:pPr>
+    </w:lvl>
+    <w:lvl w:ilvl="8" w:tplc="0809001B" w:tentative="1">
+      <w:start w:val="1"/>
+      <w:numFmt w:val="lowerRoman"/>
+      <w:lvlText w:val="%9."/>
+      <w:lvlJc w:val="right"/>
+      <w:pPr>
+        <w:ind w:left="6840" w:hanging="180"/>
+      </w:pPr>
+    </w:lvl>
+  </w:abstractNum>
+  <w:abstractNum w:abstractNumId="2" w15:restartNumberingAfterBreak="0">
     <w:nsid w:val="454409C6"/>
     <w:multiLevelType w:val="hybridMultilevel"/>
     <w:tmpl w:val="E9922430"/>
@@ -612,7 +744,7 @@
       </w:pPr>
     </w:lvl>
   </w:abstractNum>
-  <w:abstractNum w:abstractNumId="2" w15:restartNumberingAfterBreak="0">
+  <w:abstractNum w:abstractNumId="3" w15:restartNumberingAfterBreak="0">
     <w:nsid w:val="485C316C"/>
     <w:multiLevelType w:val="hybridMultilevel"/>
     <w:tmpl w:val="7F34501A"/>
@@ -701,7 +833,7 @@
       </w:pPr>
     </w:lvl>
   </w:abstractNum>
-  <w:abstractNum w:abstractNumId="3" w15:restartNumberingAfterBreak="0">
+  <w:abstractNum w:abstractNumId="4" w15:restartNumberingAfterBreak="0">
     <w:nsid w:val="692B5CC2"/>
     <w:multiLevelType w:val="hybridMultilevel"/>
     <w:tmpl w:val="281E5DE6"/>
@@ -791,16 +923,19 @@
     </w:lvl>
   </w:abstractNum>
   <w:num w:numId="1" w16cid:durableId="1384138697">
-    <w:abstractNumId w:val="2"/>
+    <w:abstractNumId w:val="3"/>
   </w:num>
   <w:num w:numId="2" w16cid:durableId="794376191">
-    <w:abstractNumId w:val="3"/>
+    <w:abstractNumId w:val="4"/>
   </w:num>
   <w:num w:numId="3" w16cid:durableId="1874462742">
-    <w:abstractNumId w:val="1"/>
+    <w:abstractNumId w:val="2"/>
   </w:num>
   <w:num w:numId="4" w16cid:durableId="1535658205">
     <w:abstractNumId w:val="0"/>
+  </w:num>
+  <w:num w:numId="5" w16cid:durableId="487749831">
+    <w:abstractNumId w:val="1"/>
   </w:num>
 </w:numbering>
 </file>

</xml_diff>

<commit_message>
Addedd the Withdrawl function
</commit_message>
<xml_diff>
--- a/FC723 Portfolio Assessment 2 – Documentation/FC723 Portfolio Assessment 2 – P461989/psudocodes_and_notes.docx
+++ b/FC723 Portfolio Assessment 2 – Documentation/FC723 Portfolio Assessment 2 – P461989/psudocodes_and_notes.docx
@@ -257,7 +257,15 @@
         <w:t>-The app must store balance in 2’s compliments and display it to user in decimal.</w:t>
       </w:r>
       <w:r>
-        <w:t xml:space="preserve">  So I have to make 2 functions to convert from decimal to binary and the opposite.</w:t>
+        <w:t xml:space="preserve">  </w:t>
+      </w:r>
+      <w:proofErr w:type="gramStart"/>
+      <w:r>
+        <w:t>So</w:t>
+      </w:r>
+      <w:proofErr w:type="gramEnd"/>
+      <w:r>
+        <w:t xml:space="preserve"> I have to make 2 functions to convert from decimal to binary and the opposite.</w:t>
       </w:r>
     </w:p>
     <w:p>
@@ -271,7 +279,21 @@
         <w:rPr>
           <w:color w:val="FF0000"/>
         </w:rPr>
-        <w:t>Check Valid password psudocode:</w:t>
+        <w:t xml:space="preserve">Check Valid password </w:t>
+      </w:r>
+      <w:proofErr w:type="spellStart"/>
+      <w:r>
+        <w:rPr>
+          <w:color w:val="FF0000"/>
+        </w:rPr>
+        <w:t>psudocode</w:t>
+      </w:r>
+      <w:proofErr w:type="spellEnd"/>
+      <w:r>
+        <w:rPr>
+          <w:color w:val="FF0000"/>
+        </w:rPr>
+        <w:t>:</w:t>
       </w:r>
     </w:p>
     <w:p>
@@ -365,7 +387,21 @@
         <w:rPr>
           <w:color w:val="FF0000"/>
         </w:rPr>
-        <w:t>Deposit psudocode:</w:t>
+        <w:t xml:space="preserve">Deposit </w:t>
+      </w:r>
+      <w:proofErr w:type="spellStart"/>
+      <w:r>
+        <w:rPr>
+          <w:color w:val="FF0000"/>
+        </w:rPr>
+        <w:t>psudocode</w:t>
+      </w:r>
+      <w:proofErr w:type="spellEnd"/>
+      <w:r>
+        <w:rPr>
+          <w:color w:val="FF0000"/>
+        </w:rPr>
+        <w:t>:</w:t>
       </w:r>
     </w:p>
     <w:p>
@@ -377,7 +413,7 @@
         </w:numPr>
       </w:pPr>
       <w:r>
-        <w:t>Take the input as float</w:t>
+        <w:t>Take input username</w:t>
       </w:r>
     </w:p>
     <w:p>
@@ -389,7 +425,7 @@
         </w:numPr>
       </w:pPr>
       <w:r>
-        <w:t>Take the intger number out of the float</w:t>
+        <w:t>Check if username is the same</w:t>
       </w:r>
     </w:p>
     <w:p>
@@ -401,7 +437,7 @@
         </w:numPr>
       </w:pPr>
       <w:r>
-        <w:t>Store the intger amount  in balance after converting it to 2’compleement</w:t>
+        <w:t>Take the input as float</w:t>
       </w:r>
     </w:p>
     <w:p>
@@ -413,8 +449,202 @@
         </w:numPr>
       </w:pPr>
       <w:r>
-        <w:t xml:space="preserve">Store the float amount in the floats_amount in the account </w:t>
-      </w:r>
+        <w:t xml:space="preserve">Take the </w:t>
+      </w:r>
+      <w:proofErr w:type="spellStart"/>
+      <w:r>
+        <w:t>intger</w:t>
+      </w:r>
+      <w:proofErr w:type="spellEnd"/>
+      <w:r>
+        <w:t xml:space="preserve"> number out of the float</w:t>
+      </w:r>
+    </w:p>
+    <w:p>
+      <w:pPr>
+        <w:pStyle w:val="ListParagraph"/>
+        <w:numPr>
+          <w:ilvl w:val="0"/>
+          <w:numId w:val="5"/>
+        </w:numPr>
+      </w:pPr>
+      <w:r>
+        <w:t xml:space="preserve">Store the </w:t>
+      </w:r>
+      <w:proofErr w:type="spellStart"/>
+      <w:r>
+        <w:t>intger</w:t>
+      </w:r>
+      <w:proofErr w:type="spellEnd"/>
+      <w:r>
+        <w:t xml:space="preserve"> amount  in balance after converting it to 2’compleement</w:t>
+      </w:r>
+    </w:p>
+    <w:p>
+      <w:pPr>
+        <w:pStyle w:val="ListParagraph"/>
+        <w:numPr>
+          <w:ilvl w:val="0"/>
+          <w:numId w:val="5"/>
+        </w:numPr>
+        <w:pBdr>
+          <w:bottom w:val="double" w:sz="6" w:space="1" w:color="auto"/>
+        </w:pBdr>
+      </w:pPr>
+      <w:r>
+        <w:t xml:space="preserve">Store the float amount in the </w:t>
+      </w:r>
+      <w:proofErr w:type="spellStart"/>
+      <w:r>
+        <w:t>floats_amount</w:t>
+      </w:r>
+      <w:proofErr w:type="spellEnd"/>
+      <w:r>
+        <w:t xml:space="preserve"> in the account </w:t>
+      </w:r>
+    </w:p>
+    <w:p>
+      <w:pPr>
+        <w:pStyle w:val="ListParagraph"/>
+        <w:ind w:left="1080"/>
+        <w:rPr>
+          <w:color w:val="FF0000"/>
+        </w:rPr>
+      </w:pPr>
+      <w:r>
+        <w:rPr>
+          <w:color w:val="FF0000"/>
+        </w:rPr>
+        <w:t xml:space="preserve">Show balance function </w:t>
+      </w:r>
+      <w:proofErr w:type="spellStart"/>
+      <w:r>
+        <w:rPr>
+          <w:color w:val="FF0000"/>
+        </w:rPr>
+        <w:t>psudocode</w:t>
+      </w:r>
+      <w:proofErr w:type="spellEnd"/>
+      <w:r>
+        <w:rPr>
+          <w:color w:val="FF0000"/>
+        </w:rPr>
+        <w:t>:</w:t>
+      </w:r>
+    </w:p>
+    <w:p>
+      <w:pPr>
+        <w:pStyle w:val="ListParagraph"/>
+        <w:numPr>
+          <w:ilvl w:val="0"/>
+          <w:numId w:val="6"/>
+        </w:numPr>
+        <w:rPr>
+          <w:color w:val="000000" w:themeColor="text1"/>
+        </w:rPr>
+      </w:pPr>
+      <w:r>
+        <w:rPr>
+          <w:color w:val="000000" w:themeColor="text1"/>
+        </w:rPr>
+        <w:t>Take username input</w:t>
+      </w:r>
+    </w:p>
+    <w:p>
+      <w:pPr>
+        <w:pStyle w:val="ListParagraph"/>
+        <w:numPr>
+          <w:ilvl w:val="0"/>
+          <w:numId w:val="6"/>
+        </w:numPr>
+        <w:rPr>
+          <w:color w:val="000000" w:themeColor="text1"/>
+        </w:rPr>
+      </w:pPr>
+      <w:r>
+        <w:rPr>
+          <w:color w:val="000000" w:themeColor="text1"/>
+        </w:rPr>
+        <w:t>Check if the username is the same</w:t>
+      </w:r>
+    </w:p>
+    <w:p>
+      <w:pPr>
+        <w:pStyle w:val="ListParagraph"/>
+        <w:numPr>
+          <w:ilvl w:val="0"/>
+          <w:numId w:val="6"/>
+        </w:numPr>
+        <w:rPr>
+          <w:color w:val="000000" w:themeColor="text1"/>
+        </w:rPr>
+      </w:pPr>
+      <w:r>
+        <w:rPr>
+          <w:color w:val="000000" w:themeColor="text1"/>
+        </w:rPr>
+        <w:t>Convert the balance to decimal</w:t>
+      </w:r>
+    </w:p>
+    <w:p>
+      <w:pPr>
+        <w:pStyle w:val="ListParagraph"/>
+        <w:numPr>
+          <w:ilvl w:val="0"/>
+          <w:numId w:val="6"/>
+        </w:numPr>
+        <w:rPr>
+          <w:color w:val="000000" w:themeColor="text1"/>
+        </w:rPr>
+      </w:pPr>
+      <w:r>
+        <w:rPr>
+          <w:color w:val="000000" w:themeColor="text1"/>
+        </w:rPr>
+        <w:t>Get the float amount in the account</w:t>
+      </w:r>
+    </w:p>
+    <w:p>
+      <w:pPr>
+        <w:pStyle w:val="ListParagraph"/>
+        <w:numPr>
+          <w:ilvl w:val="0"/>
+          <w:numId w:val="6"/>
+        </w:numPr>
+        <w:rPr>
+          <w:color w:val="000000" w:themeColor="text1"/>
+        </w:rPr>
+      </w:pPr>
+      <w:r>
+        <w:rPr>
+          <w:color w:val="000000" w:themeColor="text1"/>
+        </w:rPr>
+        <w:t>Get the sum of the float amount and the balance in decimal</w:t>
+      </w:r>
+    </w:p>
+    <w:p>
+      <w:pPr>
+        <w:pStyle w:val="ListParagraph"/>
+        <w:numPr>
+          <w:ilvl w:val="0"/>
+          <w:numId w:val="6"/>
+        </w:numPr>
+        <w:rPr>
+          <w:color w:val="000000" w:themeColor="text1"/>
+        </w:rPr>
+      </w:pPr>
+      <w:r>
+        <w:rPr>
+          <w:color w:val="000000" w:themeColor="text1"/>
+        </w:rPr>
+        <w:t>Print the total</w:t>
+      </w:r>
+    </w:p>
+    <w:p>
+      <w:pPr>
+        <w:pStyle w:val="ListParagraph"/>
+        <w:ind w:left="1080"/>
+      </w:pPr>
     </w:p>
     <w:p>
       <w:pPr>
@@ -922,6 +1152,95 @@
       </w:pPr>
     </w:lvl>
   </w:abstractNum>
+  <w:abstractNum w:abstractNumId="5" w15:restartNumberingAfterBreak="0">
+    <w:nsid w:val="6CD153FC"/>
+    <w:multiLevelType w:val="hybridMultilevel"/>
+    <w:tmpl w:val="FCEA4ED6"/>
+    <w:lvl w:ilvl="0" w:tplc="6728E0A0">
+      <w:start w:val="1"/>
+      <w:numFmt w:val="decimal"/>
+      <w:lvlText w:val="%1-"/>
+      <w:lvlJc w:val="left"/>
+      <w:pPr>
+        <w:ind w:left="1440" w:hanging="360"/>
+      </w:pPr>
+      <w:rPr>
+        <w:rFonts w:hint="default"/>
+      </w:rPr>
+    </w:lvl>
+    <w:lvl w:ilvl="1" w:tplc="08090019" w:tentative="1">
+      <w:start w:val="1"/>
+      <w:numFmt w:val="lowerLetter"/>
+      <w:lvlText w:val="%2."/>
+      <w:lvlJc w:val="left"/>
+      <w:pPr>
+        <w:ind w:left="2160" w:hanging="360"/>
+      </w:pPr>
+    </w:lvl>
+    <w:lvl w:ilvl="2" w:tplc="0809001B" w:tentative="1">
+      <w:start w:val="1"/>
+      <w:numFmt w:val="lowerRoman"/>
+      <w:lvlText w:val="%3."/>
+      <w:lvlJc w:val="right"/>
+      <w:pPr>
+        <w:ind w:left="2880" w:hanging="180"/>
+      </w:pPr>
+    </w:lvl>
+    <w:lvl w:ilvl="3" w:tplc="0809000F" w:tentative="1">
+      <w:start w:val="1"/>
+      <w:numFmt w:val="decimal"/>
+      <w:lvlText w:val="%4."/>
+      <w:lvlJc w:val="left"/>
+      <w:pPr>
+        <w:ind w:left="3600" w:hanging="360"/>
+      </w:pPr>
+    </w:lvl>
+    <w:lvl w:ilvl="4" w:tplc="08090019" w:tentative="1">
+      <w:start w:val="1"/>
+      <w:numFmt w:val="lowerLetter"/>
+      <w:lvlText w:val="%5."/>
+      <w:lvlJc w:val="left"/>
+      <w:pPr>
+        <w:ind w:left="4320" w:hanging="360"/>
+      </w:pPr>
+    </w:lvl>
+    <w:lvl w:ilvl="5" w:tplc="0809001B" w:tentative="1">
+      <w:start w:val="1"/>
+      <w:numFmt w:val="lowerRoman"/>
+      <w:lvlText w:val="%6."/>
+      <w:lvlJc w:val="right"/>
+      <w:pPr>
+        <w:ind w:left="5040" w:hanging="180"/>
+      </w:pPr>
+    </w:lvl>
+    <w:lvl w:ilvl="6" w:tplc="0809000F" w:tentative="1">
+      <w:start w:val="1"/>
+      <w:numFmt w:val="decimal"/>
+      <w:lvlText w:val="%7."/>
+      <w:lvlJc w:val="left"/>
+      <w:pPr>
+        <w:ind w:left="5760" w:hanging="360"/>
+      </w:pPr>
+    </w:lvl>
+    <w:lvl w:ilvl="7" w:tplc="08090019" w:tentative="1">
+      <w:start w:val="1"/>
+      <w:numFmt w:val="lowerLetter"/>
+      <w:lvlText w:val="%8."/>
+      <w:lvlJc w:val="left"/>
+      <w:pPr>
+        <w:ind w:left="6480" w:hanging="360"/>
+      </w:pPr>
+    </w:lvl>
+    <w:lvl w:ilvl="8" w:tplc="0809001B" w:tentative="1">
+      <w:start w:val="1"/>
+      <w:numFmt w:val="lowerRoman"/>
+      <w:lvlText w:val="%9."/>
+      <w:lvlJc w:val="right"/>
+      <w:pPr>
+        <w:ind w:left="7200" w:hanging="180"/>
+      </w:pPr>
+    </w:lvl>
+  </w:abstractNum>
   <w:num w:numId="1" w16cid:durableId="1384138697">
     <w:abstractNumId w:val="3"/>
   </w:num>
@@ -936,6 +1255,9 @@
   </w:num>
   <w:num w:numId="5" w16cid:durableId="487749831">
     <w:abstractNumId w:val="1"/>
+  </w:num>
+  <w:num w:numId="6" w16cid:durableId="545947127">
+    <w:abstractNumId w:val="5"/>
   </w:num>
 </w:numbering>
 </file>

</xml_diff>